<commit_message>
Uniformise le délai de 48 h, et le « nous » du récit
Le site annonçait le même délai de trois façons : « 48 h » sur la fiche
produit, « 48 heures ouvrées » dans la FAQ et dans les CGV. C'est désormais
« ouvrées » partout, dans les trois langues — la nuance compte, et une
promesse d'expédition se lit au pied de la lettre.

La réponse de la FAQ disait deux fois « commande » dans la même phrase :
« Votre commande part sous 48 heures ouvrées après votre commande ». Le
délai n'est plus énoncé qu'une fois.

Et le récit se donne à la première personne dès son sujet : « Nous, Jixuan
(originaire du Sichuan) et Antoine (originaire de France), tombons sous le
charme… ». L'anglais et le chinois reprennent la même construction.

Co-Authored-By: Claude Opus 5 <noreply@anthropic.com>
Claude-Session: https://claude.ai/code/session_01TdPmDZXduvNbe7E8ZfBSyg
</commit_message>
<xml_diff>
--- a/contenu/yunma-contenu-fr.docx
+++ b/contenu/yunma-contenu-fr.docx
@@ -8710,7 +8710,7 @@
           <w:sz w:val="22"/>
           <w:szCs w:val="22"/>
         </w:rPr>
-        <w:t xml:space="preserve">Tout commence en 2019, lors d’un premier voyage au Yunnan. Jixuan (originaire du Sichuan) et Antoine (originaire de France), nous tombons sous le charme de cette région hors du temps. Année après année, nous partons explorer ses montagnes, ses terroirs et ses producteurs. De cette découverte du terroir yunnanais est née une évidence : révéler au monde l’excellence de ces cafés encore trop peu connus du grand public.</w:t>
+        <w:t xml:space="preserve">Tout commence en 2019, lors d’un premier voyage au Yunnan. Nous, Jixuan (originaire du Sichuan) et Antoine (originaire de France), tombons sous le charme de cette région hors du temps. Année après année, nous partons explorer ses montagnes, ses terroirs et ses producteurs. De cette découverte du terroir yunnanais est née une évidence : révéler au monde l’excellence de ces cafés encore trop peu connus du grand public.</w:t>
       </w:r>
     </w:p>
     <w:p>
@@ -10837,7 +10837,7 @@
           <w:sz w:val="22"/>
           <w:szCs w:val="22"/>
         </w:rPr>
-        <w:t xml:space="preserve">Nous torréfions régulièrement en petites séries. Votre commande part sous 48 heures ouvrées après votre commande avec la torréfaction la plus proche.</w:t>
+        <w:t xml:space="preserve">Nous torréfions régulièrement en petites séries. Votre commande part sous 48 heures ouvrées, avec les cafés issus de la torréfaction la plus proche.</w:t>
       </w:r>
     </w:p>
     <w:p>
@@ -14071,7 +14071,7 @@
           <w:sz w:val="22"/>
           <w:szCs w:val="22"/>
         </w:rPr>
-        <w:t xml:space="preserve">Expédié sous 48 h — livraison offerte dès 50 €</w:t>
+        <w:t xml:space="preserve">Expédié sous 48 h ouvrées — livraison offerte dès 50 €</w:t>
       </w:r>
     </w:p>
     <w:p>

</xml_diff>

<commit_message>
Dit exactement ce que le site conserve, dans les mentions légales
Le paragraphe « Cookies » annonçait « des cookies strictement nécessaires au
fonctionnement du panier et du paiement ». Vérification faite dans un vrai
navigateur, sur six pages et après un ajout au panier : le site ne dépose
aucun cookie, document.cookie reste vide, et aucun domaine extérieur n'est
contacté — pas une police, pas une statistique, pas un pixel.

Ce qu'il conserve tient dans la mémoire locale du navigateur : la langue
choisie et le contenu du panier. C'est autre chose qu'un cookie, cela ne
quitte jamais l'appareil, et le texte le dit maintenant tel quel — avec la
manière de l'effacer.

Les cookies de Shopify restent nommés, mais à leur place : ils sont déposés
sur le domaine de Shopify, au moment du paiement, et relèvent de sa politique
à elle.

Co-Authored-By: Claude Opus 5 <noreply@anthropic.com>
Claude-Session: https://claude.ai/code/session_01TdPmDZXduvNbe7E8ZfBSyg
</commit_message>
<xml_diff>
--- a/contenu/yunma-contenu-fr.docx
+++ b/contenu/yunma-contenu-fr.docx
@@ -12706,7 +12706,77 @@
           <w:sz w:val="22"/>
           <w:szCs w:val="22"/>
         </w:rPr>
-        <w:t xml:space="preserve">Le site ne dépose aucun cookie publicitaire. Seuls des cookies strictement nécessaires au fonctionnement du panier et du paiement (Shopify) sont utilisés.</w:t>
+        <w:t xml:space="preserve">Le site ne dépose aucun cookie — ni publicitaire, ni de mesure d’audience. Il n’y a pas d’outil de statistiques, pas de bouton de réseau social traçant, et aucune police ni ressource chargée depuis un service tiers : toutes les pages sont servies par le site lui-même.</w:t>
+      </w:r>
+    </w:p>
+    <w:p>
+      <w:pPr>
+        <w:spacing w:after="40" w:before="200"/>
+      </w:pPr>
+      <w:r>
+        <w:rPr>
+          <w:b/>
+          <w:bCs/>
+          <w:color w:val="55524A"/>
+          <w:sz w:val="19"/>
+          <w:szCs w:val="19"/>
+        </w:rPr>
+        <w:t xml:space="preserve">Paragraphe 2</w:t>
+      </w:r>
+      <w:r>
+        <w:rPr>
+          <w:color w:val="B95F2C"/>
+          <w:sz w:val="19"/>
+          <w:szCs w:val="19"/>
+        </w:rPr>
+        <w:t xml:space="preserve">   [mentions.5.paragraphe.2]</w:t>
+      </w:r>
+    </w:p>
+    <w:p>
+      <w:pPr>
+        <w:spacing w:after="0"/>
+      </w:pPr>
+      <w:r>
+        <w:rPr>
+          <w:sz w:val="22"/>
+          <w:szCs w:val="22"/>
+        </w:rPr>
+        <w:t xml:space="preserve">Deux informations sont conservées dans la mémoire locale de votre navigateur : la langue que vous avez choisie, et le contenu de votre panier. Elles y restent, ne sont transmises à personne, et servent uniquement à vous éviter de tout ressaisir d’une page à l’autre. Vous pouvez les effacer à tout moment en vidant les données du site depuis votre navigateur.</w:t>
+      </w:r>
+    </w:p>
+    <w:p>
+      <w:pPr>
+        <w:spacing w:after="40" w:before="200"/>
+      </w:pPr>
+      <w:r>
+        <w:rPr>
+          <w:b/>
+          <w:bCs/>
+          <w:color w:val="55524A"/>
+          <w:sz w:val="19"/>
+          <w:szCs w:val="19"/>
+        </w:rPr>
+        <w:t xml:space="preserve">Paragraphe 3</w:t>
+      </w:r>
+      <w:r>
+        <w:rPr>
+          <w:color w:val="B95F2C"/>
+          <w:sz w:val="19"/>
+          <w:szCs w:val="19"/>
+        </w:rPr>
+        <w:t xml:space="preserve">   [mentions.5.paragraphe.3]</w:t>
+      </w:r>
+    </w:p>
+    <w:p>
+      <w:pPr>
+        <w:spacing w:after="0"/>
+      </w:pPr>
+      <w:r>
+        <w:rPr>
+          <w:sz w:val="22"/>
+          <w:szCs w:val="22"/>
+        </w:rPr>
+        <w:t xml:space="preserve">Le panier s’appuie sur l’interface de vente de Shopify, et le paiement se déroule ensuite sur le domaine de Shopify, qui dépose ses propres cookies et applique sa propre politique de confidentialité.</w:t>
       </w:r>
     </w:p>
     <w:p>

</xml_diff>